<commit_message>
Deploying to gh-pages from @ ucdavis/ettbc@da2a0afd34f6dabd0dc759a8f9e28a9772c44806 🚀
</commit_message>
<xml_diff>
--- a/vignettes/articles/quarto_article.docx
+++ b/vignettes/articles/quarto_article.docx
@@ -15,7 +15,7 @@
         <w:pStyle w:val="Author"/>
       </w:pPr>
       <w:r>
-        <w:t xml:space="preserve">UC Davis Seroepidemiology Research Group (UCD-SERG)</w:t>
+        <w:t xml:space="preserve">Douglas Ezra Morrison</w:t>
       </w:r>
     </w:p>
     <w:p>
@@ -40,7 +40,7 @@
         <w:rPr>
           <w:rStyle w:val="NormalTok"/>
         </w:rPr>
-        <w:t xml:space="preserve">(rpt)</w:t>
+        <w:t xml:space="preserve">(ettbc)</w:t>
       </w:r>
     </w:p>
     <w:bookmarkStart w:id="9" w:name="overview"/>

</xml_diff>